<commit_message>
Paper §3.6/E1: digitised-data fits and pairing-loophole result; muon note §3.1 cost targets and beam-heat recovery; README/EXPERIMENTS/VERIFICATION
Co-Authored-By: Claude Opus 5.5 <noreply@anthropic.com>
Claude-Session: https://claude.ai/code/session_01Nh8jCABRuj7uKFFiU3YHUY
</commit_message>
<xml_diff>
--- a/notes/muon_hybrid/muon_hybrid_note.docx
+++ b/notes/muon_hybrid/muon_hybrid_note.docx
@@ -1012,6 +1012,168 @@
       </w:r>
       <w:r>
         <w:t xml:space="preserve">spallation.</w:t>
+      </w:r>
+      <w:r>
+        <w:t xml:space="preserve"> </w:t>
+      </w:r>
+      <w:r>
+        <w:t xml:space="preserve">Recovering</w:t>
+      </w:r>
+      <w:r>
+        <w:t xml:space="preserve"> </w:t>
+      </w:r>
+      <w:r>
+        <w:t xml:space="preserve">the</w:t>
+      </w:r>
+      <w:r>
+        <w:t xml:space="preserve"> </w:t>
+      </w:r>
+      <w:r>
+        <w:t xml:space="preserve">beam</w:t>
+      </w:r>
+      <w:r>
+        <w:t xml:space="preserve"> </w:t>
+      </w:r>
+      <w:r>
+        <w:t xml:space="preserve">heat</w:t>
+      </w:r>
+      <w:r>
+        <w:t xml:space="preserve"> </w:t>
+      </w:r>
+      <w:r>
+        <w:t xml:space="preserve">from</w:t>
+      </w:r>
+      <w:r>
+        <w:t xml:space="preserve"> </w:t>
+      </w:r>
+      <w:r>
+        <w:t xml:space="preserve">the</w:t>
+      </w:r>
+      <w:r>
+        <w:t xml:space="preserve"> </w:t>
+      </w:r>
+      <w:r>
+        <w:t xml:space="preserve">pion-production</w:t>
+      </w:r>
+      <w:r>
+        <w:t xml:space="preserve"> </w:t>
+      </w:r>
+      <w:r>
+        <w:t xml:space="preserve">target</w:t>
+      </w:r>
+      <w:r>
+        <w:t xml:space="preserve"> </w:t>
+      </w:r>
+      <w:r>
+        <w:t xml:space="preserve">adds</w:t>
+      </w:r>
+      <w:r>
+        <w:t xml:space="preserve"> </w:t>
+      </w:r>
+      <w:r>
+        <w:t xml:space="preserve">a</w:t>
+      </w:r>
+      <w:r>
+        <w:t xml:space="preserve"> </w:t>
+      </w:r>
+      <w:r>
+        <w:t xml:space="preserve">further</w:t>
+      </w:r>
+      <w:r>
+        <w:t xml:space="preserve"> </w:t>
+      </w:r>
+      <w:r>
+        <w:t xml:space="preserve">~0.13–0.24</w:t>
+      </w:r>
+      <w:r>
+        <w:t xml:space="preserve"> </w:t>
+      </w:r>
+      <w:r>
+        <w:t xml:space="preserve">to</w:t>
+      </w:r>
+      <w:r>
+        <w:t xml:space="preserve"> </w:t>
+      </w:r>
+      <w:r>
+        <w:t xml:space="preserve">the</w:t>
+      </w:r>
+      <w:r>
+        <w:t xml:space="preserve"> </w:t>
+      </w:r>
+      <w:r>
+        <w:t xml:space="preserve">electric</w:t>
+      </w:r>
+      <w:r>
+        <w:t xml:space="preserve"> </w:t>
+      </w:r>
+      <w:r>
+        <w:t xml:space="preserve">gain</w:t>
+      </w:r>
+      <w:r>
+        <w:t xml:space="preserve"> </w:t>
+      </w:r>
+      <w:r>
+        <w:t xml:space="preserve">(to</w:t>
+      </w:r>
+      <w:r>
+        <w:t xml:space="preserve"> </w:t>
+      </w:r>
+      <w:r>
+        <w:t xml:space="preserve">1.37</w:t>
+      </w:r>
+      <w:r>
+        <w:t xml:space="preserve"> </w:t>
+      </w:r>
+      <w:r>
+        <w:t xml:space="preserve">with</w:t>
+      </w:r>
+      <w:r>
+        <w:t xml:space="preserve"> </w:t>
+      </w:r>
+      <w:r>
+        <w:t xml:space="preserve">a</w:t>
+      </w:r>
+      <w:r>
+        <w:t xml:space="preserve"> </w:t>
+      </w:r>
+      <w:r>
+        <w:t xml:space="preserve">~2</w:t>
+      </w:r>
+      <w:r>
+        <w:t xml:space="preserve"> </w:t>
+      </w:r>
+      <w:r>
+        <w:t xml:space="preserve">GeV</w:t>
+      </w:r>
+      <w:r>
+        <w:t xml:space="preserve"> </w:t>
+      </w:r>
+      <w:r>
+        <w:t xml:space="preserve">muon</w:t>
+      </w:r>
+      <w:r>
+        <w:t xml:space="preserve"> </w:t>
+      </w:r>
+      <w:r>
+        <w:t xml:space="preserve">source</w:t>
+      </w:r>
+      <w:r>
+        <w:t xml:space="preserve"> </w:t>
+      </w:r>
+      <w:r>
+        <w:t xml:space="preserve">and</w:t>
+      </w:r>
+      <w:r>
+        <w:t xml:space="preserve"> </w:t>
+      </w:r>
+      <w:r>
+        <w:t xml:space="preserve">all</w:t>
+      </w:r>
+      <w:r>
+        <w:t xml:space="preserve"> </w:t>
+      </w:r>
+      <w:r>
+        <w:t xml:space="preserve">levers).</w:t>
       </w:r>
       <w:r>
         <w:t xml:space="preserve"> </w:t>
@@ -2001,7 +2163,91 @@
       </w:r>
     </w:p>
     <w:bookmarkEnd w:id="28"/>
-    <w:bookmarkStart w:id="29" w:name="conclusions"/>
+    <w:bookmarkStart w:id="29" w:name="how-cheap-must-muons-get-notebook-16"/>
+    <w:p>
+      <w:pPr>
+        <w:pStyle w:val="Heading1"/>
+      </w:pPr>
+      <w:r>
+        <w:t xml:space="preserve">3.1 How cheap must muons get? (notebook 16)</w:t>
+      </w:r>
+    </w:p>
+    <w:p>
+      <w:pPr>
+        <w:pStyle w:val="FirstParagraph"/>
+      </w:pPr>
+      <w:r>
+        <w:t xml:space="preserve">Turning the question around: the beam energy per stopped muon E</w:t>
+      </w:r>
+      <w:r>
+        <w:rPr>
+          <w:vertAlign w:val="subscript"/>
+        </w:rPr>
+        <w:t xml:space="preserve">μ</w:t>
+      </w:r>
+      <w:r>
+        <w:t xml:space="preserve"> </w:t>
+      </w:r>
+      <w:r>
+        <w:t xml:space="preserve">that each goal allows. With today’s cycle (X = 150), net electricity needs E</w:t>
+      </w:r>
+      <w:r>
+        <w:rPr>
+          <w:vertAlign w:val="subscript"/>
+        </w:rPr>
+        <w:t xml:space="preserve">μ</w:t>
+      </w:r>
+      <w:r>
+        <w:t xml:space="preserve"> </w:t>
+      </w:r>
+      <w:r>
+        <w:t xml:space="preserve">≈ 0.54–0.62 GeV, 8–9× cheaper than today. That implies 1.6 stopped muons per GeV of beam, 23% of the absolute ceiling set by the π⁻ rest mass. Cheaper muons alone are therefore not a realistic route. The cycle levers move the target further than the production chain can. With X = 336 and conversion efficiencies of 0.5/0.6, break-even rises to 2.3 GeV per muon, or 3.0 GeV if the beam heat is recovered.</w:t>
+      </w:r>
+    </w:p>
+    <w:p>
+      <w:pPr>
+        <w:pStyle w:val="BodyText"/>
+      </w:pPr>
+      <w:r>
+        <w:rPr>
+          <w:bCs/>
+          <w:b/>
+        </w:rPr>
+        <w:t xml:space="preserve">Beam-heat recovery</w:t>
+      </w:r>
+      <w:r>
+        <w:t xml:space="preserve"> </w:t>
+      </w:r>
+      <w:r>
+        <w:t xml:space="preserve">is a lever the earlier estimates leave out. Most of the proton beam’s energy ends as heat in the pion-production target. Recovering 80% of it through the thermal cycle raises the electric gain from 0.11 to 0.24 today, and from 1.13 to</w:t>
+      </w:r>
+      <w:r>
+        <w:t xml:space="preserve"> </w:t>
+      </w:r>
+      <w:r>
+        <w:rPr>
+          <w:bCs/>
+          <w:b/>
+        </w:rPr>
+        <w:t xml:space="preserve">1.37</w:t>
+      </w:r>
+      <w:r>
+        <w:t xml:space="preserve"> </w:t>
+      </w:r>
+      <w:r>
+        <w:t xml:space="preserve">for a ~2 GeV muon source with all the cycle levers. As a neutron source, μCF ties spallation at ~5.5 GeV per muon today. With the cycle levers it wins at any muon cost below ~12 GeV, so for waste burning the sticking and cycling measurements matter more than muon cost. A power plant (gain 4) still needs ~0.6 GeV per muon even with every lever.</w:t>
+      </w:r>
+    </w:p>
+    <w:p>
+      <w:pPr>
+        <w:pStyle w:val="BodyText"/>
+      </w:pPr>
+      <w:r>
+        <w:t xml:space="preserve">The 5 GeV (today) and ~2 GeV (design) muon costs are recalled from secondary sources, and the 0.8 heat-recovery fraction is assumed.</w:t>
+      </w:r>
+    </w:p>
+    <w:bookmarkEnd w:id="29"/>
+    <w:bookmarkStart w:id="30" w:name="conclusions"/>
     <w:p>
       <w:pPr>
         <w:pStyle w:val="Heading1"/>
@@ -2155,8 +2401,8 @@
         <w:t xml:space="preserve">Analysis and drafting assisted by an AI model (Claude, Anthropic).</w:t>
       </w:r>
     </w:p>
-    <w:bookmarkEnd w:id="29"/>
-    <w:bookmarkStart w:id="30" w:name="X6124453415f564835dff5118d95445dad041b3a"/>
+    <w:bookmarkEnd w:id="30"/>
+    <w:bookmarkStart w:id="31" w:name="X6124453415f564835dff5118d95445dad041b3a"/>
     <w:p>
       <w:pPr>
         <w:pStyle w:val="Heading1"/>
@@ -2225,7 +2471,7 @@
         <w:t xml:space="preserve">GEANT4 studies of spallation neutron yield for ADS targets, Proc. IPAC 2016, TUPOY019.</w:t>
       </w:r>
     </w:p>
-    <w:bookmarkEnd w:id="30"/>
+    <w:bookmarkEnd w:id="31"/>
     <w:sectPr/>
   </w:body>
 </w:document>

</xml_diff>

<commit_message>
Notebook 16 on sourced muon inputs (5 GeV, Kelly 2.5x incl. recovery, 3.0 GeV active target, Yin et al. X scenarios); remove double-counted heat recovery; muon note, README, VERIFICATION
Co-Authored-By: Claude Opus 5.5 <noreply@anthropic.com>
Claude-Session: https://claude.ai/code/session_01Nh8jCABRuj7uKFFiU3YHUY
</commit_message>
<xml_diff>
--- a/notes/muon_hybrid/muon_hybrid_note.docx
+++ b/notes/muon_hybrid/muon_hybrid_note.docx
@@ -1017,7 +1017,43 @@
         <w:t xml:space="preserve"> </w:t>
       </w:r>
       <w:r>
-        <w:t xml:space="preserve">Recovering</w:t>
+        <w:t xml:space="preserve">With</w:t>
+      </w:r>
+      <w:r>
+        <w:t xml:space="preserve"> </w:t>
+      </w:r>
+      <w:r>
+        <w:t xml:space="preserve">sourced</w:t>
+      </w:r>
+      <w:r>
+        <w:t xml:space="preserve"> </w:t>
+      </w:r>
+      <w:r>
+        <w:t xml:space="preserve">muon-cost</w:t>
+      </w:r>
+      <w:r>
+        <w:t xml:space="preserve"> </w:t>
+      </w:r>
+      <w:r>
+        <w:t xml:space="preserve">scenarios</w:t>
+      </w:r>
+      <w:r>
+        <w:t xml:space="preserve"> </w:t>
+      </w:r>
+      <w:r>
+        <w:t xml:space="preserve">(2–3</w:t>
+      </w:r>
+      <w:r>
+        <w:t xml:space="preserve"> </w:t>
+      </w:r>
+      <w:r>
+        <w:t xml:space="preserve">GeV)</w:t>
+      </w:r>
+      <w:r>
+        <w:t xml:space="preserve"> </w:t>
+      </w:r>
+      <w:r>
+        <w:t xml:space="preserve">and</w:t>
       </w:r>
       <w:r>
         <w:t xml:space="preserve"> </w:t>
@@ -1029,19 +1065,73 @@
         <w:t xml:space="preserve"> </w:t>
       </w:r>
       <w:r>
-        <w:t xml:space="preserve">beam</w:t>
-      </w:r>
-      <w:r>
-        <w:t xml:space="preserve"> </w:t>
-      </w:r>
-      <w:r>
-        <w:t xml:space="preserve">heat</w:t>
-      </w:r>
-      <w:r>
-        <w:t xml:space="preserve"> </w:t>
-      </w:r>
-      <w:r>
-        <w:t xml:space="preserve">from</w:t>
+        <w:t xml:space="preserve">fusions-per-muon</w:t>
+      </w:r>
+      <w:r>
+        <w:t xml:space="preserve"> </w:t>
+      </w:r>
+      <w:r>
+        <w:t xml:space="preserve">values</w:t>
+      </w:r>
+      <w:r>
+        <w:t xml:space="preserve"> </w:t>
+      </w:r>
+      <w:r>
+        <w:t xml:space="preserve">of</w:t>
+      </w:r>
+      <w:r>
+        <w:t xml:space="preserve"> </w:t>
+      </w:r>
+      <w:r>
+        <w:t xml:space="preserve">recent</w:t>
+      </w:r>
+      <w:r>
+        <w:t xml:space="preserve"> </w:t>
+      </w:r>
+      <w:r>
+        <w:t xml:space="preserve">polarisation</w:t>
+      </w:r>
+      <w:r>
+        <w:t xml:space="preserve"> </w:t>
+      </w:r>
+      <w:r>
+        <w:t xml:space="preserve">studies,</w:t>
+      </w:r>
+      <w:r>
+        <w:t xml:space="preserve"> </w:t>
+      </w:r>
+      <w:r>
+        <w:t xml:space="preserve">net</w:t>
+      </w:r>
+      <w:r>
+        <w:t xml:space="preserve"> </w:t>
+      </w:r>
+      <w:r>
+        <w:t xml:space="preserve">electricity</w:t>
+      </w:r>
+      <w:r>
+        <w:t xml:space="preserve"> </w:t>
+      </w:r>
+      <w:r>
+        <w:t xml:space="preserve">is</w:t>
+      </w:r>
+      <w:r>
+        <w:t xml:space="preserve"> </w:t>
+      </w:r>
+      <w:r>
+        <w:t xml:space="preserve">reached</w:t>
+      </w:r>
+      <w:r>
+        <w:t xml:space="preserve"> </w:t>
+      </w:r>
+      <w:r>
+        <w:t xml:space="preserve">only</w:t>
+      </w:r>
+      <w:r>
+        <w:t xml:space="preserve"> </w:t>
+      </w:r>
+      <w:r>
+        <w:t xml:space="preserve">at</w:t>
       </w:r>
       <w:r>
         <w:t xml:space="preserve"> </w:t>
@@ -1053,73 +1143,37 @@
         <w:t xml:space="preserve"> </w:t>
       </w:r>
       <w:r>
-        <w:t xml:space="preserve">pion-production</w:t>
-      </w:r>
-      <w:r>
-        <w:t xml:space="preserve"> </w:t>
-      </w:r>
-      <w:r>
-        <w:t xml:space="preserve">target</w:t>
-      </w:r>
-      <w:r>
-        <w:t xml:space="preserve"> </w:t>
-      </w:r>
-      <w:r>
-        <w:t xml:space="preserve">adds</w:t>
-      </w:r>
-      <w:r>
-        <w:t xml:space="preserve"> </w:t>
-      </w:r>
-      <w:r>
-        <w:t xml:space="preserve">a</w:t>
-      </w:r>
-      <w:r>
-        <w:t xml:space="preserve"> </w:t>
-      </w:r>
-      <w:r>
-        <w:t xml:space="preserve">further</w:t>
-      </w:r>
-      <w:r>
-        <w:t xml:space="preserve"> </w:t>
-      </w:r>
-      <w:r>
-        <w:t xml:space="preserve">~0.13–0.24</w:t>
-      </w:r>
-      <w:r>
-        <w:t xml:space="preserve"> </w:t>
-      </w:r>
-      <w:r>
-        <w:t xml:space="preserve">to</w:t>
-      </w:r>
-      <w:r>
-        <w:t xml:space="preserve"> </w:t>
-      </w:r>
-      <w:r>
-        <w:t xml:space="preserve">the</w:t>
-      </w:r>
-      <w:r>
-        <w:t xml:space="preserve"> </w:t>
-      </w:r>
-      <w:r>
-        <w:t xml:space="preserve">electric</w:t>
-      </w:r>
-      <w:r>
-        <w:t xml:space="preserve"> </w:t>
-      </w:r>
-      <w:r>
-        <w:t xml:space="preserve">gain</w:t>
-      </w:r>
-      <w:r>
-        <w:t xml:space="preserve"> </w:t>
-      </w:r>
-      <w:r>
-        <w:t xml:space="preserve">(to</w:t>
-      </w:r>
-      <w:r>
-        <w:t xml:space="preserve"> </w:t>
-      </w:r>
-      <w:r>
-        <w:t xml:space="preserve">1.37</w:t>
+        <w:t xml:space="preserve">threshold</w:t>
+      </w:r>
+      <w:r>
+        <w:t xml:space="preserve"> </w:t>
+      </w:r>
+      <w:r>
+        <w:t xml:space="preserve">(gain</w:t>
+      </w:r>
+      <w:r>
+        <w:t xml:space="preserve"> </w:t>
+      </w:r>
+      <w:r>
+        <w:t xml:space="preserve">≈</w:t>
+      </w:r>
+      <w:r>
+        <w:t xml:space="preserve"> </w:t>
+      </w:r>
+      <w:r>
+        <w:t xml:space="preserve">1.0–1.1),</w:t>
+      </w:r>
+      <w:r>
+        <w:t xml:space="preserve"> </w:t>
+      </w:r>
+      <w:r>
+        <w:t xml:space="preserve">and</w:t>
+      </w:r>
+      <w:r>
+        <w:t xml:space="preserve"> </w:t>
+      </w:r>
+      <w:r>
+        <w:t xml:space="preserve">only</w:t>
       </w:r>
       <w:r>
         <w:t xml:space="preserve"> </w:t>
@@ -1131,49 +1185,19 @@
         <w:t xml:space="preserve"> </w:t>
       </w:r>
       <w:r>
-        <w:t xml:space="preserve">a</w:t>
-      </w:r>
-      <w:r>
-        <w:t xml:space="preserve"> </w:t>
-      </w:r>
-      <w:r>
-        <w:t xml:space="preserve">~2</w:t>
-      </w:r>
-      <w:r>
-        <w:t xml:space="preserve"> </w:t>
-      </w:r>
-      <w:r>
-        <w:t xml:space="preserve">GeV</w:t>
-      </w:r>
-      <w:r>
-        <w:t xml:space="preserve"> </w:t>
-      </w:r>
-      <w:r>
-        <w:t xml:space="preserve">muon</w:t>
-      </w:r>
-      <w:r>
-        <w:t xml:space="preserve"> </w:t>
-      </w:r>
-      <w:r>
-        <w:t xml:space="preserve">source</w:t>
-      </w:r>
-      <w:r>
-        <w:t xml:space="preserve"> </w:t>
-      </w:r>
-      <w:r>
-        <w:t xml:space="preserve">and</w:t>
-      </w:r>
-      <w:r>
-        <w:t xml:space="preserve"> </w:t>
-      </w:r>
-      <w:r>
-        <w:t xml:space="preserve">all</w:t>
-      </w:r>
-      <w:r>
-        <w:t xml:space="preserve"> </w:t>
-      </w:r>
-      <w:r>
-        <w:t xml:space="preserve">levers).</w:t>
+        <w:t xml:space="preserve">50%/60%</w:t>
+      </w:r>
+      <w:r>
+        <w:t xml:space="preserve"> </w:t>
+      </w:r>
+      <w:r>
+        <w:t xml:space="preserve">conversion</w:t>
+      </w:r>
+      <w:r>
+        <w:t xml:space="preserve"> </w:t>
+      </w:r>
+      <w:r>
+        <w:t xml:space="preserve">efficiencies.</w:t>
       </w:r>
       <w:r>
         <w:t xml:space="preserve"> </w:t>
@@ -2177,7 +2201,7 @@
         <w:pStyle w:val="FirstParagraph"/>
       </w:pPr>
       <w:r>
-        <w:t xml:space="preserve">Turning the question around: the beam energy per stopped muon E</w:t>
+        <w:t xml:space="preserve">We turn the question around and ask what beam energy per stopped muon, E</w:t>
       </w:r>
       <w:r>
         <w:rPr>
@@ -2186,10 +2210,7 @@
         <w:t xml:space="preserve">μ</w:t>
       </w:r>
       <w:r>
-        <w:t xml:space="preserve"> </w:t>
-      </w:r>
-      <w:r>
-        <w:t xml:space="preserve">that each goal allows. With today’s cycle (X = 150), net electricity needs E</w:t>
+        <w:t xml:space="preserve">, each goal allows. With today’s cycle (X ≈ 150), net electricity needs E</w:t>
       </w:r>
       <w:r>
         <w:rPr>
@@ -2201,41 +2222,46 @@
         <w:t xml:space="preserve"> </w:t>
       </w:r>
       <w:r>
-        <w:t xml:space="preserve">≈ 0.54–0.62 GeV, 8–9× cheaper than today. That implies 1.6 stopped muons per GeV of beam, 23% of the absolute ceiling set by the π⁻ rest mass. Cheaper muons alone are therefore not a realistic route. The cycle levers move the target further than the production chain can. With X = 336 and conversion efficiencies of 0.5/0.6, break-even rises to 2.3 GeV per muon, or 3.0 GeV if the beam heat is recovered.</w:t>
+        <w:t xml:space="preserve">≈ 0.54–0.62 GeV, 8–9× cheaper than today’s ~5 GeV. That would take 1.6 stopped muons per GeV of beam, 23% of the ceiling set by the π⁻ rest mass. Cheaper muons alone are not a realistic route.</w:t>
       </w:r>
     </w:p>
     <w:p>
       <w:pPr>
         <w:pStyle w:val="BodyText"/>
       </w:pPr>
+      <w:r>
+        <w:t xml:space="preserve">Using sourced scenarios: muon cost 5 GeV today, 2 GeV for Kelly et al. (2021) and 3.0 GeV for a simulated active-target source. Fusions per muon follow Yin et al. (2026): 148 unpolarised, 193 polarised and 300–350 for their</w:t>
+      </w:r>
+      <w:r>
+        <w:t xml:space="preserve"> </w:t>
+      </w:r>
+      <w:r>
+        <w:t xml:space="preserve">“</w:t>
+      </w:r>
+      <w:r>
+        <w:t xml:space="preserve">multi-technology synergy</w:t>
+      </w:r>
+      <w:r>
+        <w:t xml:space="preserve">”</w:t>
+      </w:r>
+      <w:r>
+        <w:t xml:space="preserve"> </w:t>
+      </w:r>
+      <w:r>
+        <w:t xml:space="preserve">case. At today’s conversion efficiencies (0.4/0.4), no scenario reaches net electricity; the best supported case gives 0.58. With 0.5/0.6, a 2 GeV source at X ≈ 325 reaches</w:t>
+      </w:r>
+      <w:r>
+        <w:t xml:space="preserve"> </w:t>
+      </w:r>
       <w:r>
         <w:rPr>
           <w:bCs/>
           <w:b/>
         </w:rPr>
-        <w:t xml:space="preserve">Beam-heat recovery</w:t>
-      </w:r>
-      <w:r>
-        <w:t xml:space="preserve"> </w:t>
-      </w:r>
-      <w:r>
-        <w:t xml:space="preserve">is a lever the earlier estimates leave out. Most of the proton beam’s energy ends as heat in the pion-production target. Recovering 80% of it through the thermal cycle raises the electric gain from 0.11 to 0.24 today, and from 1.13 to</w:t>
-      </w:r>
-      <w:r>
-        <w:t xml:space="preserve"> </w:t>
-      </w:r>
-      <w:r>
-        <w:rPr>
-          <w:bCs/>
-          <w:b/>
-        </w:rPr>
-        <w:t xml:space="preserve">1.37</w:t>
-      </w:r>
-      <w:r>
-        <w:t xml:space="preserve"> </w:t>
-      </w:r>
-      <w:r>
-        <w:t xml:space="preserve">for a ~2 GeV muon source with all the cycle levers. As a neutron source, μCF ties spallation at ~5.5 GeV per muon today. With the cycle levers it wins at any muon cost below ~12 GeV, so for waste burning the sticking and cycling measurements matter more than muon cost. A power plant (gain 4) still needs ~0.6 GeV per muon even with every lever.</w:t>
+        <w:t xml:space="preserve">gain 1.09</w:t>
+      </w:r>
+      <w:r>
+        <w:t xml:space="preserve">, and a 3.0 GeV active target with beam-heat recovery reaches 0.97. Both are at the threshold. Clear margin needs the extrapolated engineering-limit cycle (X ≈ 550; gain 1.85 at 2 GeV).</w:t>
       </w:r>
     </w:p>
     <w:p>
@@ -2243,7 +2269,15 @@
         <w:pStyle w:val="BodyText"/>
       </w:pPr>
       <w:r>
-        <w:t xml:space="preserve">The 5 GeV (today) and ~2 GeV (design) muon costs are recalled from secondary sources, and the 0.8 heat-recovery fraction is assumed.</w:t>
+        <w:t xml:space="preserve">Recovering beam heat from the pion-production target raises a 5 GeV source from 0.11 to 0.23. This is one ingredient of Kelly et al.’s 2.5× reduction, not an extra lever on top of it.</w:t>
+      </w:r>
+    </w:p>
+    <w:p>
+      <w:pPr>
+        <w:pStyle w:val="BodyText"/>
+      </w:pPr>
+      <w:r>
+        <w:t xml:space="preserve">As a neutron source, μCF ties spallation today (break-even 5.4 GeV per muon). With polarised fuel it wins below 7.0 GeV per muon, so for waste burning the cycle measurements matter more than muon cost.</w:t>
       </w:r>
     </w:p>
     <w:bookmarkEnd w:id="29"/>
@@ -2380,7 +2414,7 @@
         <w:t xml:space="preserve"> </w:t>
       </w:r>
       <w:r>
-        <w:t xml:space="preserve">Notebooks 09 and 10 at https://github.com/m1110/cold-fusion-gap. Inputs and their verification status: VERIFICATION.md (μCF data and muon cost at secondary/abstract level; spallation yield from GEANT4 studies, abstract-level).</w:t>
+        <w:t xml:space="preserve">Notebooks 09, 10 and 16 at https://github.com/m1110/cold-fusion-gap. Inputs and their verification status: VERIFICATION.md (μCF data and muon cost at secondary/abstract level; spallation yield from GEANT4 studies, abstract-level).</w:t>
       </w:r>
     </w:p>
     <w:p>
@@ -2444,7 +2478,31 @@
         <w:pStyle w:val="Compact"/>
       </w:pPr>
       <w:r>
-        <w:t xml:space="preserve">Muon-Catalyzed Nuclear Fusion: physical mechanism, bottleneck breakthroughs and an engineering pathway, arXiv:2605.26432 (2026).</w:t>
+        <w:t xml:space="preserve">Yin X., Kou W., Chen X., Muon-catalyzed nuclear fusion: physical mechanism, bottleneck breakthroughs and an engineering pathway, arXiv:2605.26432 (2026) (read in full).</w:t>
+      </w:r>
+    </w:p>
+    <w:p>
+      <w:pPr>
+        <w:numPr>
+          <w:ilvl w:val="0"/>
+          <w:numId w:val="1002"/>
+        </w:numPr>
+        <w:pStyle w:val="Compact"/>
+      </w:pPr>
+      <w:r>
+        <w:t xml:space="preserve">Parisi J. F., Rutkowski A., Isotope production in muon-catalyzed-fusion systems, arXiv:2511.20951 (2025) (read in full).</w:t>
+      </w:r>
+    </w:p>
+    <w:p>
+      <w:pPr>
+        <w:numPr>
+          <w:ilvl w:val="0"/>
+          <w:numId w:val="1002"/>
+        </w:numPr>
+        <w:pStyle w:val="Compact"/>
+      </w:pPr>
+      <w:r>
+        <w:t xml:space="preserve">Jändel M., Design principles for efficient muon production in muon-catalyzed fusion reactors, J. Fusion Energy 8, 81 (1989).</w:t>
       </w:r>
     </w:p>
     <w:p>

</xml_diff>